<commit_message>
@ Informe GRUPAL: Figura 3 (NAT translations) actualizada a 8.8.8.8
- Reemplazada la Figura 3 con captura nueva de show ip nat translations
  (muestra 172.29.0.2:1025 -> 8.8.8.8:53 y HTTP a 64.223.190.94), sin 200.100.100.x.
- Epigrafe con puertos reales. Informe 100% consistente con el .pkt.
- FINAL-08-nat-translations.png agregada; duplicados reordenados.

Co-Authored-By: Claude Opus 4.8 <noreply@anthropic.com>
@
</commit_message>
<xml_diff>
--- a/TP integrador/Informe Proyecto Integrador - HidroNova (GRUPAL).docx
+++ b/TP integrador/Informe Proyecto Integrador - HidroNova (GRUPAL).docx
@@ -10533,7 +10533,7 @@
         </w:rPr>
         <w:drawing>
           <wp:inline distT="0" distB="0" distL="0" distR="0" wp14:anchorId="6ED3458E" wp14:editId="5E142BB2">
-            <wp:extent cx="6485182" cy="6348010"/>
+            <wp:extent cx="6500000" cy="6240306"/>
             <wp:effectExtent l="0" t="0" r="0" b="0"/>
             <wp:docPr id="3" name="Imagen 3"/>
             <wp:cNvGraphicFramePr>
@@ -10564,7 +10564,7 @@
                   <pic:spPr bwMode="auto">
                     <a:xfrm>
                       <a:off x="0" y="0"/>
-                      <a:ext cx="6485182" cy="6348010"/>
+                      <a:ext cx="6500000" cy="6240306"/>
                     </a:xfrm>
                     <a:prstGeom prst="rect">
                       <a:avLst/>
@@ -10652,7 +10652,7 @@
           <w:rStyle w:val="CdigoHTML"/>
           <w:lang w:val="es-ES"/>
         </w:rPr>
-        <w:t>172.29.0.2:1028 → 8.8.8.8:53</w:t>
+        <w:t>172.29.0.2:1025 → 8.8.8.8:53</w:t>
       </w:r>
       <w:r>
         <w:rPr>
@@ -10666,7 +10666,7 @@
           <w:rStyle w:val="CdigoHTML"/>
           <w:lang w:val="es-ES"/>
         </w:rPr>
-        <w:t>172.29.0.21:1038 → 64.223.190.94:80</w:t>
+        <w:t>172.29.0.21:1025 → 64.223.190.94:80</w:t>
       </w:r>
       <w:r>
         <w:rPr>

</xml_diff>